<commit_message>
시험 설계서 (STD) 추가 / RTM (STP,STD 추가)
</commit_message>
<xml_diff>
--- a/Document/PLC/SW 구현계획서(SIP).docx
+++ b/Document/PLC/SW 구현계획서(SIP).docx
@@ -3673,15 +3673,7 @@
                 <w:sz w:val="20"/>
                 <w:szCs w:val="20"/>
               </w:rPr>
-              <w:t>0.</w:t>
-            </w:r>
-            <w:r>
-              <w:rPr>
-                <w:rFonts w:ascii="맑은 고딕" w:eastAsia="맑은 고딕" w:hAnsi="맑은 고딕" w:cs="맑은 고딕" w:hint="eastAsia"/>
-                <w:sz w:val="20"/>
-                <w:szCs w:val="20"/>
-              </w:rPr>
-              <w:t>4</w:t>
+              <w:t>0.4</w:t>
             </w:r>
           </w:p>
         </w:tc>
@@ -3752,15 +3744,7 @@
                 <w:sz w:val="20"/>
                 <w:szCs w:val="20"/>
               </w:rPr>
-              <w:t>2</w:t>
-            </w:r>
-            <w:r>
-              <w:rPr>
-                <w:rFonts w:ascii="맑은 고딕" w:eastAsia="맑은 고딕" w:hAnsi="맑은 고딕" w:cs="맑은 고딕" w:hint="eastAsia"/>
-                <w:sz w:val="20"/>
-                <w:szCs w:val="20"/>
-              </w:rPr>
-              <w:t>8</w:t>
+              <w:t>28</w:t>
             </w:r>
           </w:p>
         </w:tc>
@@ -3811,7 +3795,7 @@
               <w:spacing w:line="240" w:lineRule="auto"/>
               <w:jc w:val="center"/>
               <w:rPr>
-                <w:rFonts w:ascii="맑은 고딕" w:eastAsia="맑은 고딕" w:hAnsi="맑은 고딕" w:cs="맑은 고딕" w:hint="eastAsia"/>
+                <w:rFonts w:ascii="맑은 고딕" w:eastAsia="맑은 고딕" w:hAnsi="맑은 고딕" w:cs="맑은 고딕"/>
                 <w:sz w:val="20"/>
                 <w:szCs w:val="20"/>
               </w:rPr>
@@ -20265,7 +20249,7 @@
             <w:pPr>
               <w:jc w:val="center"/>
               <w:rPr>
-                <w:rFonts w:ascii="맑은 고딕" w:eastAsia="맑은 고딕" w:hAnsi="맑은 고딕" w:cs="맑은 고딕" w:hint="eastAsia"/>
+                <w:rFonts w:ascii="맑은 고딕" w:eastAsia="맑은 고딕" w:hAnsi="맑은 고딕" w:cs="맑은 고딕"/>
                 <w:sz w:val="20"/>
                 <w:szCs w:val="20"/>
               </w:rPr>
@@ -23375,7 +23359,7 @@
                 <w:sz w:val="20"/>
                 <w:szCs w:val="20"/>
               </w:rPr>
-              <w:t>메인 화면-사용자 검색어 공백 값 입력</w:t>
+              <w:t>사용자 검색어 공백 값 입력</w:t>
             </w:r>
           </w:p>
         </w:tc>
@@ -23552,7 +23536,7 @@
                 <w:sz w:val="20"/>
                 <w:szCs w:val="20"/>
               </w:rPr>
-              <w:t>메인 화면-현재 접속 중인 사용자 검색</w:t>
+              <w:t>현재 접속 중인 사용자 검색</w:t>
             </w:r>
           </w:p>
         </w:tc>
@@ -23730,7 +23714,7 @@
                 <w:sz w:val="20"/>
                 <w:szCs w:val="20"/>
               </w:rPr>
-              <w:t>메인 화면-현재 접속 중이지 않은 사용자 검색</w:t>
+              <w:t>현재 접속 중이지 않은 사용자 검색</w:t>
             </w:r>
           </w:p>
         </w:tc>
@@ -23923,7 +23907,7 @@
                 <w:sz w:val="20"/>
                 <w:szCs w:val="20"/>
               </w:rPr>
-              <w:t>메인 화면-현재 검색 결과에 일치하는 사용자의 접속 상태 변경</w:t>
+              <w:t>현재 검색 결과에 일치하는 사용자의 접속 상태 변경</w:t>
             </w:r>
           </w:p>
         </w:tc>
@@ -24060,7 +24044,7 @@
                 <w:sz w:val="20"/>
                 <w:szCs w:val="20"/>
               </w:rPr>
-              <w:t>메인 화면-사용자 검색어 입력 값 유효성 여부</w:t>
+              <w:t>사용자 검색어 입력 값 유효성 여부</w:t>
             </w:r>
           </w:p>
         </w:tc>
@@ -24128,15 +24112,6 @@
             </w:pPr>
             <w:r>
               <w:rPr>
-                <w:rFonts w:ascii="맑은 고딕" w:eastAsia="맑은 고딕" w:hAnsi="맑은 고딕" w:cs="맑은 고딕" w:hint="eastAsia"/>
-                <w:sz w:val="20"/>
-                <w:szCs w:val="20"/>
-              </w:rPr>
-              <w:t xml:space="preserve">해당 특수문자 이스케이프 처리 및 </w:t>
-            </w:r>
-            <w:r>
-              <w:rPr>
-                <w:rFonts w:ascii="맑은 고딕" w:eastAsia="맑은 고딕" w:hAnsi="맑은 고딕" w:cs="맑은 고딕"/>
                 <w:sz w:val="20"/>
                 <w:szCs w:val="20"/>
               </w:rPr>
@@ -24144,11 +24119,59 @@
             </w:r>
             <w:r>
               <w:rPr>
-                <w:rFonts w:ascii="맑은 고딕" w:eastAsia="맑은 고딕" w:hAnsi="맑은 고딕" w:cs="맑은 고딕" w:hint="eastAsia"/>
-                <w:sz w:val="20"/>
-                <w:szCs w:val="20"/>
-              </w:rPr>
-              <w:t>해당 검색 결과가 없습니다</w:t>
+                <w:sz w:val="20"/>
+                <w:szCs w:val="20"/>
+              </w:rPr>
+              <w:t>학번은</w:t>
+            </w:r>
+            <w:r>
+              <w:rPr>
+                <w:sz w:val="20"/>
+                <w:szCs w:val="20"/>
+              </w:rPr>
+              <w:t xml:space="preserve"> </w:t>
+            </w:r>
+            <w:r>
+              <w:rPr>
+                <w:sz w:val="20"/>
+                <w:szCs w:val="20"/>
+              </w:rPr>
+              <w:t>숫자만</w:t>
+            </w:r>
+            <w:r>
+              <w:rPr>
+                <w:sz w:val="20"/>
+                <w:szCs w:val="20"/>
+              </w:rPr>
+              <w:t xml:space="preserve"> </w:t>
+            </w:r>
+            <w:r>
+              <w:rPr>
+                <w:sz w:val="20"/>
+                <w:szCs w:val="20"/>
+              </w:rPr>
+              <w:t>입력</w:t>
+            </w:r>
+            <w:r>
+              <w:rPr>
+                <w:sz w:val="20"/>
+                <w:szCs w:val="20"/>
+              </w:rPr>
+              <w:t xml:space="preserve"> </w:t>
+            </w:r>
+            <w:r>
+              <w:rPr>
+                <w:sz w:val="20"/>
+                <w:szCs w:val="20"/>
+              </w:rPr>
+              <w:t>가능합니다</w:t>
+            </w:r>
+            <w:r>
+              <w:rPr>
+                <w:sz w:val="20"/>
+                <w:szCs w:val="20"/>
+              </w:rPr>
+              <w:t>.</w:t>
             </w:r>
             <w:r>
               <w:rPr>
@@ -24160,11 +24183,43 @@
             </w:r>
             <w:r>
               <w:rPr>
-                <w:rFonts w:ascii="맑은 고딕" w:eastAsia="맑은 고딕" w:hAnsi="맑은 고딕" w:cs="맑은 고딕" w:hint="eastAsia"/>
-                <w:sz w:val="20"/>
-                <w:szCs w:val="20"/>
-              </w:rPr>
-              <w:t>에 관한 메시지 표시</w:t>
+                <w:rFonts w:hint="eastAsia"/>
+                <w:sz w:val="20"/>
+                <w:szCs w:val="20"/>
+              </w:rPr>
+              <w:t>라는</w:t>
+            </w:r>
+            <w:r>
+              <w:rPr>
+                <w:rFonts w:hint="eastAsia"/>
+                <w:sz w:val="20"/>
+                <w:szCs w:val="20"/>
+              </w:rPr>
+              <w:t xml:space="preserve"> </w:t>
+            </w:r>
+            <w:r>
+              <w:rPr>
+                <w:rFonts w:hint="eastAsia"/>
+                <w:sz w:val="20"/>
+                <w:szCs w:val="20"/>
+              </w:rPr>
+              <w:t>메시지가</w:t>
+            </w:r>
+            <w:r>
+              <w:rPr>
+                <w:rFonts w:hint="eastAsia"/>
+                <w:sz w:val="20"/>
+                <w:szCs w:val="20"/>
+              </w:rPr>
+              <w:t xml:space="preserve">  </w:t>
+            </w:r>
+            <w:r>
+              <w:rPr>
+                <w:rFonts w:hint="eastAsia"/>
+                <w:sz w:val="20"/>
+                <w:szCs w:val="20"/>
+              </w:rPr>
+              <w:t>표시</w:t>
             </w:r>
           </w:p>
         </w:tc>
@@ -25130,50 +25185,31 @@
                 <w:sz w:val="20"/>
                 <w:szCs w:val="20"/>
               </w:rPr>
-              <w:t xml:space="preserve">메인 화면 사용자 검색 결과 목록 리스트에서 대화 </w:t>
-            </w:r>
-            <w:r>
-              <w:rPr>
-                <w:rFonts w:ascii="맑은 고딕" w:eastAsia="맑은 고딕" w:hAnsi="맑은 고딕" w:cs="맑은 고딕" w:hint="eastAsia"/>
-                <w:sz w:val="20"/>
-                <w:szCs w:val="20"/>
-              </w:rPr>
-              <w:lastRenderedPageBreak/>
-              <w:t>상대 클릭</w:t>
-            </w:r>
-          </w:p>
-        </w:tc>
-        <w:tc>
-          <w:tcPr>
-            <w:tcW w:w="1558" w:type="dxa"/>
-            <w:vAlign w:val="center"/>
-          </w:tcPr>
-          <w:p>
-            <w:pPr>
-              <w:jc w:val="center"/>
-              <w:rPr>
-                <w:rFonts w:ascii="맑은 고딕" w:eastAsia="맑은 고딕" w:hAnsi="맑은 고딕" w:cs="맑은 고딕"/>
-                <w:sz w:val="20"/>
-                <w:szCs w:val="20"/>
-              </w:rPr>
-            </w:pPr>
-            <w:r>
-              <w:rPr>
-                <w:rFonts w:ascii="맑은 고딕" w:eastAsia="맑은 고딕" w:hAnsi="맑은 고딕" w:cs="맑은 고딕" w:hint="eastAsia"/>
-                <w:sz w:val="20"/>
-                <w:szCs w:val="20"/>
-              </w:rPr>
-              <w:lastRenderedPageBreak/>
-              <w:t xml:space="preserve">선택한 사용자 목록 체크박스 활성화 및 화면 </w:t>
-            </w:r>
-            <w:r>
-              <w:rPr>
-                <w:rFonts w:ascii="맑은 고딕" w:eastAsia="맑은 고딕" w:hAnsi="맑은 고딕" w:cs="맑은 고딕" w:hint="eastAsia"/>
-                <w:sz w:val="20"/>
-                <w:szCs w:val="20"/>
-              </w:rPr>
-              <w:lastRenderedPageBreak/>
-              <w:t>표시</w:t>
+              <w:t>메인 화면 사용자 검색 결과 목록 리스트에서 대화 상대 클릭</w:t>
+            </w:r>
+          </w:p>
+        </w:tc>
+        <w:tc>
+          <w:tcPr>
+            <w:tcW w:w="1558" w:type="dxa"/>
+            <w:vAlign w:val="center"/>
+          </w:tcPr>
+          <w:p>
+            <w:pPr>
+              <w:jc w:val="center"/>
+              <w:rPr>
+                <w:rFonts w:ascii="맑은 고딕" w:eastAsia="맑은 고딕" w:hAnsi="맑은 고딕" w:cs="맑은 고딕"/>
+                <w:sz w:val="20"/>
+                <w:szCs w:val="20"/>
+              </w:rPr>
+            </w:pPr>
+            <w:r>
+              <w:rPr>
+                <w:rFonts w:ascii="맑은 고딕" w:eastAsia="맑은 고딕" w:hAnsi="맑은 고딕" w:cs="맑은 고딕" w:hint="eastAsia"/>
+                <w:sz w:val="20"/>
+                <w:szCs w:val="20"/>
+              </w:rPr>
+              <w:t>선택한 사용자 목록 체크박스 활성화 및 화면 표시</w:t>
             </w:r>
           </w:p>
         </w:tc>
@@ -25198,7 +25234,6 @@
                 <w:sz w:val="20"/>
                 <w:szCs w:val="20"/>
               </w:rPr>
-              <w:lastRenderedPageBreak/>
               <w:t>김민성</w:t>
             </w:r>
           </w:p>
@@ -25231,6 +25266,7 @@
                 <w:sz w:val="20"/>
                 <w:szCs w:val="20"/>
               </w:rPr>
+              <w:lastRenderedPageBreak/>
               <w:t>TC04-2</w:t>
             </w:r>
           </w:p>
@@ -25803,34 +25839,18 @@
               <w:ind w:left="15" w:right="1"/>
               <w:jc w:val="center"/>
               <w:rPr>
-                <w:rFonts w:ascii="맑은 고딕" w:eastAsia="맑은 고딕" w:hAnsi="맑은 고딕" w:cs="맑은 고딕" w:hint="eastAsia"/>
-                <w:sz w:val="20"/>
-                <w:szCs w:val="20"/>
-              </w:rPr>
-            </w:pPr>
-            <w:r>
-              <w:rPr>
-                <w:rFonts w:ascii="맑은 고딕" w:eastAsia="맑은 고딕" w:hAnsi="맑은 고딕" w:cs="맑은 고딕" w:hint="eastAsia"/>
-                <w:sz w:val="20"/>
-                <w:szCs w:val="20"/>
-              </w:rPr>
-              <w:t>TC0</w:t>
-            </w:r>
-            <w:r>
-              <w:rPr>
-                <w:rFonts w:ascii="맑은 고딕" w:eastAsia="맑은 고딕" w:hAnsi="맑은 고딕" w:cs="맑은 고딕" w:hint="eastAsia"/>
-                <w:sz w:val="20"/>
-                <w:szCs w:val="20"/>
-              </w:rPr>
-              <w:t>4</w:t>
-            </w:r>
-            <w:r>
-              <w:rPr>
-                <w:rFonts w:ascii="맑은 고딕" w:eastAsia="맑은 고딕" w:hAnsi="맑은 고딕" w:cs="맑은 고딕" w:hint="eastAsia"/>
-                <w:sz w:val="20"/>
-                <w:szCs w:val="20"/>
-              </w:rPr>
-              <w:t>-6</w:t>
+                <w:rFonts w:ascii="맑은 고딕" w:eastAsia="맑은 고딕" w:hAnsi="맑은 고딕" w:cs="맑은 고딕"/>
+                <w:sz w:val="20"/>
+                <w:szCs w:val="20"/>
+              </w:rPr>
+            </w:pPr>
+            <w:r>
+              <w:rPr>
+                <w:rFonts w:ascii="맑은 고딕" w:eastAsia="맑은 고딕" w:hAnsi="맑은 고딕" w:cs="맑은 고딕" w:hint="eastAsia"/>
+                <w:sz w:val="20"/>
+                <w:szCs w:val="20"/>
+              </w:rPr>
+              <w:t>TC04-6</w:t>
             </w:r>
           </w:p>
         </w:tc>
@@ -25860,7 +25880,7 @@
             <w:pPr>
               <w:jc w:val="center"/>
               <w:rPr>
-                <w:rFonts w:ascii="맑은 고딕" w:eastAsia="맑은 고딕" w:hAnsi="맑은 고딕" w:cs="맑은 고딕" w:hint="eastAsia"/>
+                <w:rFonts w:ascii="맑은 고딕" w:eastAsia="맑은 고딕" w:hAnsi="맑은 고딕" w:cs="맑은 고딕"/>
                 <w:sz w:val="20"/>
                 <w:szCs w:val="20"/>
               </w:rPr>
@@ -25884,7 +25904,7 @@
             <w:pPr>
               <w:jc w:val="center"/>
               <w:rPr>
-                <w:rFonts w:ascii="맑은 고딕" w:eastAsia="맑은 고딕" w:hAnsi="맑은 고딕" w:cs="맑은 고딕" w:hint="eastAsia"/>
+                <w:rFonts w:ascii="맑은 고딕" w:eastAsia="맑은 고딕" w:hAnsi="맑은 고딕" w:cs="맑은 고딕"/>
                 <w:sz w:val="20"/>
                 <w:szCs w:val="20"/>
               </w:rPr>
@@ -25908,7 +25928,7 @@
             <w:pPr>
               <w:jc w:val="center"/>
               <w:rPr>
-                <w:rFonts w:ascii="맑은 고딕" w:eastAsia="맑은 고딕" w:hAnsi="맑은 고딕" w:cs="맑은 고딕" w:hint="eastAsia"/>
+                <w:rFonts w:ascii="맑은 고딕" w:eastAsia="맑은 고딕" w:hAnsi="맑은 고딕" w:cs="맑은 고딕"/>
                 <w:sz w:val="20"/>
                 <w:szCs w:val="20"/>
               </w:rPr>
@@ -25956,42 +25976,18 @@
               <w:ind w:left="15" w:right="1"/>
               <w:jc w:val="center"/>
               <w:rPr>
-                <w:rFonts w:ascii="맑은 고딕" w:eastAsia="맑은 고딕" w:hAnsi="맑은 고딕" w:cs="맑은 고딕" w:hint="eastAsia"/>
-                <w:sz w:val="20"/>
-                <w:szCs w:val="20"/>
-              </w:rPr>
-            </w:pPr>
-            <w:r>
-              <w:rPr>
-                <w:rFonts w:ascii="맑은 고딕" w:eastAsia="맑은 고딕" w:hAnsi="맑은 고딕" w:cs="맑은 고딕" w:hint="eastAsia"/>
-                <w:sz w:val="20"/>
-                <w:szCs w:val="20"/>
-              </w:rPr>
-              <w:t>TC0</w:t>
-            </w:r>
-            <w:r>
-              <w:rPr>
-                <w:rFonts w:ascii="맑은 고딕" w:eastAsia="맑은 고딕" w:hAnsi="맑은 고딕" w:cs="맑은 고딕" w:hint="eastAsia"/>
-                <w:sz w:val="20"/>
-                <w:szCs w:val="20"/>
-              </w:rPr>
-              <w:t>5</w:t>
-            </w:r>
-            <w:r>
-              <w:rPr>
-                <w:rFonts w:ascii="맑은 고딕" w:eastAsia="맑은 고딕" w:hAnsi="맑은 고딕" w:cs="맑은 고딕" w:hint="eastAsia"/>
-                <w:sz w:val="20"/>
-                <w:szCs w:val="20"/>
-              </w:rPr>
-              <w:t>-</w:t>
-            </w:r>
-            <w:r>
-              <w:rPr>
-                <w:rFonts w:ascii="맑은 고딕" w:eastAsia="맑은 고딕" w:hAnsi="맑은 고딕" w:cs="맑은 고딕" w:hint="eastAsia"/>
-                <w:sz w:val="20"/>
-                <w:szCs w:val="20"/>
-              </w:rPr>
-              <w:t>1</w:t>
+                <w:rFonts w:ascii="맑은 고딕" w:eastAsia="맑은 고딕" w:hAnsi="맑은 고딕" w:cs="맑은 고딕"/>
+                <w:sz w:val="20"/>
+                <w:szCs w:val="20"/>
+              </w:rPr>
+            </w:pPr>
+            <w:r>
+              <w:rPr>
+                <w:rFonts w:ascii="맑은 고딕" w:eastAsia="맑은 고딕" w:hAnsi="맑은 고딕" w:cs="맑은 고딕" w:hint="eastAsia"/>
+                <w:sz w:val="20"/>
+                <w:szCs w:val="20"/>
+              </w:rPr>
+              <w:t>TC05-1</w:t>
             </w:r>
           </w:p>
         </w:tc>
@@ -26029,7 +26025,7 @@
             <w:pPr>
               <w:jc w:val="center"/>
               <w:rPr>
-                <w:rFonts w:ascii="맑은 고딕" w:eastAsia="맑은 고딕" w:hAnsi="맑은 고딕" w:cs="맑은 고딕" w:hint="eastAsia"/>
+                <w:rFonts w:ascii="맑은 고딕" w:eastAsia="맑은 고딕" w:hAnsi="맑은 고딕" w:cs="맑은 고딕"/>
                 <w:sz w:val="20"/>
                 <w:szCs w:val="20"/>
               </w:rPr>
@@ -26053,7 +26049,7 @@
             <w:pPr>
               <w:jc w:val="center"/>
               <w:rPr>
-                <w:rFonts w:ascii="맑은 고딕" w:eastAsia="맑은 고딕" w:hAnsi="맑은 고딕" w:cs="맑은 고딕" w:hint="eastAsia"/>
+                <w:rFonts w:ascii="맑은 고딕" w:eastAsia="맑은 고딕" w:hAnsi="맑은 고딕" w:cs="맑은 고딕"/>
                 <w:sz w:val="20"/>
                 <w:szCs w:val="20"/>
               </w:rPr>
@@ -26077,7 +26073,7 @@
             <w:pPr>
               <w:jc w:val="center"/>
               <w:rPr>
-                <w:rFonts w:ascii="맑은 고딕" w:eastAsia="맑은 고딕" w:hAnsi="맑은 고딕" w:cs="맑은 고딕" w:hint="eastAsia"/>
+                <w:rFonts w:ascii="맑은 고딕" w:eastAsia="맑은 고딕" w:hAnsi="맑은 고딕" w:cs="맑은 고딕"/>
                 <w:sz w:val="20"/>
                 <w:szCs w:val="20"/>
               </w:rPr>
@@ -26102,7 +26098,7 @@
             <w:pPr>
               <w:jc w:val="center"/>
               <w:rPr>
-                <w:rFonts w:ascii="맑은 고딕" w:eastAsia="맑은 고딕" w:hAnsi="맑은 고딕" w:cs="맑은 고딕" w:hint="eastAsia"/>
+                <w:rFonts w:ascii="맑은 고딕" w:eastAsia="맑은 고딕" w:hAnsi="맑은 고딕" w:cs="맑은 고딕"/>
                 <w:sz w:val="20"/>
                 <w:szCs w:val="20"/>
               </w:rPr>
@@ -26133,42 +26129,18 @@
               <w:ind w:left="15" w:right="1"/>
               <w:jc w:val="center"/>
               <w:rPr>
-                <w:rFonts w:ascii="맑은 고딕" w:eastAsia="맑은 고딕" w:hAnsi="맑은 고딕" w:cs="맑은 고딕" w:hint="eastAsia"/>
-                <w:sz w:val="20"/>
-                <w:szCs w:val="20"/>
-              </w:rPr>
-            </w:pPr>
-            <w:r>
-              <w:rPr>
-                <w:rFonts w:ascii="맑은 고딕" w:eastAsia="맑은 고딕" w:hAnsi="맑은 고딕" w:cs="맑은 고딕" w:hint="eastAsia"/>
-                <w:sz w:val="20"/>
-                <w:szCs w:val="20"/>
-              </w:rPr>
-              <w:t>TC0</w:t>
-            </w:r>
-            <w:r>
-              <w:rPr>
-                <w:rFonts w:ascii="맑은 고딕" w:eastAsia="맑은 고딕" w:hAnsi="맑은 고딕" w:cs="맑은 고딕" w:hint="eastAsia"/>
-                <w:sz w:val="20"/>
-                <w:szCs w:val="20"/>
-              </w:rPr>
-              <w:t>5</w:t>
-            </w:r>
-            <w:r>
-              <w:rPr>
-                <w:rFonts w:ascii="맑은 고딕" w:eastAsia="맑은 고딕" w:hAnsi="맑은 고딕" w:cs="맑은 고딕" w:hint="eastAsia"/>
-                <w:sz w:val="20"/>
-                <w:szCs w:val="20"/>
-              </w:rPr>
-              <w:t>-</w:t>
-            </w:r>
-            <w:r>
-              <w:rPr>
-                <w:rFonts w:ascii="맑은 고딕" w:eastAsia="맑은 고딕" w:hAnsi="맑은 고딕" w:cs="맑은 고딕" w:hint="eastAsia"/>
-                <w:sz w:val="20"/>
-                <w:szCs w:val="20"/>
-              </w:rPr>
-              <w:t>2</w:t>
+                <w:rFonts w:ascii="맑은 고딕" w:eastAsia="맑은 고딕" w:hAnsi="맑은 고딕" w:cs="맑은 고딕"/>
+                <w:sz w:val="20"/>
+                <w:szCs w:val="20"/>
+              </w:rPr>
+            </w:pPr>
+            <w:r>
+              <w:rPr>
+                <w:rFonts w:ascii="맑은 고딕" w:eastAsia="맑은 고딕" w:hAnsi="맑은 고딕" w:cs="맑은 고딕" w:hint="eastAsia"/>
+                <w:sz w:val="20"/>
+                <w:szCs w:val="20"/>
+              </w:rPr>
+              <w:t>TC05-2</w:t>
             </w:r>
           </w:p>
         </w:tc>
@@ -26198,7 +26170,7 @@
             <w:pPr>
               <w:jc w:val="center"/>
               <w:rPr>
-                <w:rFonts w:ascii="맑은 고딕" w:eastAsia="맑은 고딕" w:hAnsi="맑은 고딕" w:cs="맑은 고딕" w:hint="eastAsia"/>
+                <w:rFonts w:ascii="맑은 고딕" w:eastAsia="맑은 고딕" w:hAnsi="맑은 고딕" w:cs="맑은 고딕"/>
                 <w:sz w:val="20"/>
                 <w:szCs w:val="20"/>
               </w:rPr>
@@ -26222,7 +26194,7 @@
             <w:pPr>
               <w:jc w:val="center"/>
               <w:rPr>
-                <w:rFonts w:ascii="맑은 고딕" w:eastAsia="맑은 고딕" w:hAnsi="맑은 고딕" w:cs="맑은 고딕" w:hint="eastAsia"/>
+                <w:rFonts w:ascii="맑은 고딕" w:eastAsia="맑은 고딕" w:hAnsi="맑은 고딕" w:cs="맑은 고딕"/>
                 <w:sz w:val="20"/>
                 <w:szCs w:val="20"/>
               </w:rPr>
@@ -26246,7 +26218,7 @@
             <w:pPr>
               <w:jc w:val="center"/>
               <w:rPr>
-                <w:rFonts w:ascii="맑은 고딕" w:eastAsia="맑은 고딕" w:hAnsi="맑은 고딕" w:cs="맑은 고딕" w:hint="eastAsia"/>
+                <w:rFonts w:ascii="맑은 고딕" w:eastAsia="맑은 고딕" w:hAnsi="맑은 고딕" w:cs="맑은 고딕"/>
                 <w:sz w:val="20"/>
                 <w:szCs w:val="20"/>
               </w:rPr>
@@ -26411,7 +26383,31 @@
                 <w:sz w:val="20"/>
                 <w:szCs w:val="20"/>
               </w:rPr>
-              <w:t xml:space="preserve">대화방 화면에 메뉴바 클릭을 한 </w:t>
+              <w:t>대화방 화면에 메뉴바 클릭을 한 다음 친구 초대 버튼 클릭</w:t>
+            </w:r>
+          </w:p>
+        </w:tc>
+        <w:tc>
+          <w:tcPr>
+            <w:tcW w:w="1558" w:type="dxa"/>
+            <w:vAlign w:val="center"/>
+          </w:tcPr>
+          <w:p>
+            <w:pPr>
+              <w:jc w:val="center"/>
+              <w:rPr>
+                <w:rFonts w:ascii="맑은 고딕" w:eastAsia="맑은 고딕" w:hAnsi="맑은 고딕" w:cs="맑은 고딕"/>
+                <w:sz w:val="20"/>
+                <w:szCs w:val="20"/>
+              </w:rPr>
+            </w:pPr>
+            <w:r>
+              <w:rPr>
+                <w:rFonts w:ascii="맑은 고딕" w:eastAsia="맑은 고딕" w:hAnsi="맑은 고딕" w:cs="맑은 고딕" w:hint="eastAsia"/>
+                <w:sz w:val="20"/>
+                <w:szCs w:val="20"/>
+              </w:rPr>
+              <w:t xml:space="preserve">현재 접속 중인 사용자 중 해당 대화방 참여자를 제외한 사용자 </w:t>
             </w:r>
             <w:r>
               <w:rPr>
@@ -26420,41 +26416,7 @@
                 <w:szCs w:val="20"/>
               </w:rPr>
               <w:lastRenderedPageBreak/>
-              <w:t>다음 친구 초대 버튼 클릭</w:t>
-            </w:r>
-          </w:p>
-        </w:tc>
-        <w:tc>
-          <w:tcPr>
-            <w:tcW w:w="1558" w:type="dxa"/>
-            <w:vAlign w:val="center"/>
-          </w:tcPr>
-          <w:p>
-            <w:pPr>
-              <w:jc w:val="center"/>
-              <w:rPr>
-                <w:rFonts w:ascii="맑은 고딕" w:eastAsia="맑은 고딕" w:hAnsi="맑은 고딕" w:cs="맑은 고딕"/>
-                <w:sz w:val="20"/>
-                <w:szCs w:val="20"/>
-              </w:rPr>
-            </w:pPr>
-            <w:r>
-              <w:rPr>
-                <w:rFonts w:ascii="맑은 고딕" w:eastAsia="맑은 고딕" w:hAnsi="맑은 고딕" w:cs="맑은 고딕" w:hint="eastAsia"/>
-                <w:sz w:val="20"/>
-                <w:szCs w:val="20"/>
-              </w:rPr>
-              <w:lastRenderedPageBreak/>
-              <w:t xml:space="preserve">현재 접속 중인 사용자 중 해당 </w:t>
-            </w:r>
-            <w:r>
-              <w:rPr>
-                <w:rFonts w:ascii="맑은 고딕" w:eastAsia="맑은 고딕" w:hAnsi="맑은 고딕" w:cs="맑은 고딕" w:hint="eastAsia"/>
-                <w:sz w:val="20"/>
-                <w:szCs w:val="20"/>
-              </w:rPr>
-              <w:lastRenderedPageBreak/>
-              <w:t>대화방 참여자를 제외한 사용자 초대 가능 목록 리스트 모달 팝업 화면 표시</w:t>
+              <w:t>초대 가능 목록 리스트 모달 팝업 화면 표시</w:t>
             </w:r>
           </w:p>
         </w:tc>
@@ -27784,7 +27746,33 @@
                 <w:sz w:val="20"/>
                 <w:szCs w:val="20"/>
               </w:rPr>
-              <w:t xml:space="preserve">초대 상대를 선택한 상태에서 </w:t>
+              <w:t>초대 상대를 선택한 상태에서 선택된 사용자가 로그아웃</w:t>
+            </w:r>
+          </w:p>
+        </w:tc>
+        <w:tc>
+          <w:tcPr>
+            <w:tcW w:w="1558" w:type="dxa"/>
+            <w:vAlign w:val="center"/>
+          </w:tcPr>
+          <w:p>
+            <w:pPr>
+              <w:widowControl/>
+              <w:spacing w:line="240" w:lineRule="auto"/>
+              <w:jc w:val="center"/>
+              <w:rPr>
+                <w:rFonts w:ascii="맑은 고딕" w:eastAsia="맑은 고딕" w:hAnsi="맑은 고딕" w:cs="맑은 고딕"/>
+                <w:sz w:val="20"/>
+                <w:szCs w:val="20"/>
+              </w:rPr>
+            </w:pPr>
+            <w:r>
+              <w:rPr>
+                <w:rFonts w:ascii="맑은 고딕" w:eastAsia="맑은 고딕" w:hAnsi="맑은 고딕" w:cs="맑은 고딕" w:hint="eastAsia"/>
+                <w:sz w:val="20"/>
+                <w:szCs w:val="20"/>
+              </w:rPr>
+              <w:t xml:space="preserve">초대 가능 목록 리스트 업데이트 후 화면에 해당 사용자를 </w:t>
             </w:r>
             <w:r>
               <w:rPr>
@@ -27793,43 +27781,7 @@
                 <w:szCs w:val="20"/>
               </w:rPr>
               <w:lastRenderedPageBreak/>
-              <w:t>선택된 사용자가 로그아웃</w:t>
-            </w:r>
-          </w:p>
-        </w:tc>
-        <w:tc>
-          <w:tcPr>
-            <w:tcW w:w="1558" w:type="dxa"/>
-            <w:vAlign w:val="center"/>
-          </w:tcPr>
-          <w:p>
-            <w:pPr>
-              <w:widowControl/>
-              <w:spacing w:line="240" w:lineRule="auto"/>
-              <w:jc w:val="center"/>
-              <w:rPr>
-                <w:rFonts w:ascii="맑은 고딕" w:eastAsia="맑은 고딕" w:hAnsi="맑은 고딕" w:cs="맑은 고딕"/>
-                <w:sz w:val="20"/>
-                <w:szCs w:val="20"/>
-              </w:rPr>
-            </w:pPr>
-            <w:r>
-              <w:rPr>
-                <w:rFonts w:ascii="맑은 고딕" w:eastAsia="맑은 고딕" w:hAnsi="맑은 고딕" w:cs="맑은 고딕" w:hint="eastAsia"/>
-                <w:sz w:val="20"/>
-                <w:szCs w:val="20"/>
-              </w:rPr>
-              <w:lastRenderedPageBreak/>
-              <w:t xml:space="preserve">초대 가능 목록 리스트 업데이트 </w:t>
-            </w:r>
-            <w:r>
-              <w:rPr>
-                <w:rFonts w:ascii="맑은 고딕" w:eastAsia="맑은 고딕" w:hAnsi="맑은 고딕" w:cs="맑은 고딕" w:hint="eastAsia"/>
-                <w:sz w:val="20"/>
-                <w:szCs w:val="20"/>
-              </w:rPr>
-              <w:lastRenderedPageBreak/>
-              <w:t>후 화면에 해당 사용자를 오프라인으로 표시</w:t>
+              <w:t>오프라인으로 표시</w:t>
             </w:r>
           </w:p>
         </w:tc>
@@ -27868,34 +27820,18 @@
               <w:ind w:left="15" w:right="1"/>
               <w:jc w:val="center"/>
               <w:rPr>
-                <w:rFonts w:ascii="맑은 고딕" w:eastAsia="맑은 고딕" w:hAnsi="맑은 고딕" w:cs="맑은 고딕" w:hint="eastAsia"/>
-                <w:sz w:val="20"/>
-                <w:szCs w:val="20"/>
-              </w:rPr>
-            </w:pPr>
-            <w:r>
-              <w:rPr>
-                <w:rFonts w:ascii="맑은 고딕" w:eastAsia="맑은 고딕" w:hAnsi="맑은 고딕" w:cs="맑은 고딕" w:hint="eastAsia"/>
-                <w:sz w:val="20"/>
-                <w:szCs w:val="20"/>
-              </w:rPr>
-              <w:t>TC06</w:t>
-            </w:r>
-            <w:r>
-              <w:rPr>
-                <w:rFonts w:ascii="맑은 고딕" w:eastAsia="맑은 고딕" w:hAnsi="맑은 고딕" w:cs="맑은 고딕" w:hint="eastAsia"/>
-                <w:sz w:val="20"/>
-                <w:szCs w:val="20"/>
-              </w:rPr>
-              <w:t>-</w:t>
-            </w:r>
-            <w:r>
-              <w:rPr>
-                <w:rFonts w:ascii="맑은 고딕" w:eastAsia="맑은 고딕" w:hAnsi="맑은 고딕" w:cs="맑은 고딕" w:hint="eastAsia"/>
-                <w:sz w:val="20"/>
-                <w:szCs w:val="20"/>
-              </w:rPr>
-              <w:t>10</w:t>
+                <w:rFonts w:ascii="맑은 고딕" w:eastAsia="맑은 고딕" w:hAnsi="맑은 고딕" w:cs="맑은 고딕"/>
+                <w:sz w:val="20"/>
+                <w:szCs w:val="20"/>
+              </w:rPr>
+            </w:pPr>
+            <w:r>
+              <w:rPr>
+                <w:rFonts w:ascii="맑은 고딕" w:eastAsia="맑은 고딕" w:hAnsi="맑은 고딕" w:cs="맑은 고딕" w:hint="eastAsia"/>
+                <w:sz w:val="20"/>
+                <w:szCs w:val="20"/>
+              </w:rPr>
+              <w:t>TC06-10</w:t>
             </w:r>
           </w:p>
         </w:tc>
@@ -27927,7 +27863,7 @@
               <w:spacing w:line="240" w:lineRule="auto"/>
               <w:jc w:val="center"/>
               <w:rPr>
-                <w:rFonts w:ascii="맑은 고딕" w:eastAsia="맑은 고딕" w:hAnsi="맑은 고딕" w:cs="맑은 고딕" w:hint="eastAsia"/>
+                <w:rFonts w:ascii="맑은 고딕" w:eastAsia="맑은 고딕" w:hAnsi="맑은 고딕" w:cs="맑은 고딕"/>
                 <w:sz w:val="20"/>
                 <w:szCs w:val="20"/>
               </w:rPr>
@@ -27952,7 +27888,7 @@
               <w:spacing w:line="240" w:lineRule="auto"/>
               <w:jc w:val="center"/>
               <w:rPr>
-                <w:rFonts w:ascii="맑은 고딕" w:eastAsia="맑은 고딕" w:hAnsi="맑은 고딕" w:cs="맑은 고딕" w:hint="eastAsia"/>
+                <w:rFonts w:ascii="맑은 고딕" w:eastAsia="맑은 고딕" w:hAnsi="맑은 고딕" w:cs="맑은 고딕"/>
                 <w:sz w:val="20"/>
                 <w:szCs w:val="20"/>
               </w:rPr>
@@ -27977,7 +27913,7 @@
               <w:spacing w:line="240" w:lineRule="auto"/>
               <w:jc w:val="center"/>
               <w:rPr>
-                <w:rFonts w:ascii="맑은 고딕" w:eastAsia="맑은 고딕" w:hAnsi="맑은 고딕" w:cs="맑은 고딕" w:hint="eastAsia"/>
+                <w:rFonts w:ascii="맑은 고딕" w:eastAsia="맑은 고딕" w:hAnsi="맑은 고딕" w:cs="맑은 고딕"/>
                 <w:sz w:val="20"/>
                 <w:szCs w:val="20"/>
               </w:rPr>
@@ -29200,7 +29136,7 @@
                 <w:sz w:val="20"/>
                 <w:szCs w:val="20"/>
               </w:rPr>
-              <w:t xml:space="preserve"> 버튼을 </w:t>
+              <w:t xml:space="preserve"> 버튼을 클릭해 파일 선택 또는 파일 드롭 </w:t>
             </w:r>
             <w:r>
               <w:rPr>
@@ -29209,7 +29145,7 @@
                 <w:szCs w:val="20"/>
               </w:rPr>
               <w:lastRenderedPageBreak/>
-              <w:t>클릭해 파일 선택 또는 파일 드롭 영역에 파일 드래그 앤 드롭</w:t>
+              <w:t>영역에 파일 드래그 앤 드롭</w:t>
             </w:r>
           </w:p>
         </w:tc>
@@ -29251,7 +29187,23 @@
                 <w:sz w:val="20"/>
                 <w:szCs w:val="20"/>
               </w:rPr>
-              <w:t xml:space="preserve">파일 </w:t>
+              <w:t>파일 허용 확장자 제한</w:t>
+            </w:r>
+            <w:r>
+              <w:rPr>
+                <w:rFonts w:ascii="맑은 고딕" w:eastAsia="맑은 고딕" w:hAnsi="맑은 고딕" w:cs="맑은 고딕"/>
+                <w:sz w:val="20"/>
+                <w:szCs w:val="20"/>
+              </w:rPr>
+              <w:t>’</w:t>
+            </w:r>
+            <w:r>
+              <w:rPr>
+                <w:rFonts w:ascii="맑은 고딕" w:eastAsia="맑은 고딕" w:hAnsi="맑은 고딕" w:cs="맑은 고딕" w:hint="eastAsia"/>
+                <w:sz w:val="20"/>
+                <w:szCs w:val="20"/>
+              </w:rPr>
+              <w:t xml:space="preserve">에 관한 </w:t>
             </w:r>
             <w:r>
               <w:rPr>
@@ -29260,23 +29212,7 @@
                 <w:szCs w:val="20"/>
               </w:rPr>
               <w:lastRenderedPageBreak/>
-              <w:t>허용 확장자 제한</w:t>
-            </w:r>
-            <w:r>
-              <w:rPr>
-                <w:rFonts w:ascii="맑은 고딕" w:eastAsia="맑은 고딕" w:hAnsi="맑은 고딕" w:cs="맑은 고딕"/>
-                <w:sz w:val="20"/>
-                <w:szCs w:val="20"/>
-              </w:rPr>
-              <w:t>’</w:t>
-            </w:r>
-            <w:r>
-              <w:rPr>
-                <w:rFonts w:ascii="맑은 고딕" w:eastAsia="맑은 고딕" w:hAnsi="맑은 고딕" w:cs="맑은 고딕" w:hint="eastAsia"/>
-                <w:sz w:val="20"/>
-                <w:szCs w:val="20"/>
-              </w:rPr>
-              <w:t>에 관한 메시지 표시</w:t>
+              <w:t>메시지 표시</w:t>
             </w:r>
           </w:p>
         </w:tc>
@@ -30771,125 +30707,143 @@
                 <w:sz w:val="20"/>
                 <w:szCs w:val="20"/>
               </w:rPr>
+              <w:t>TC09</w:t>
+            </w:r>
+            <w:r>
+              <w:rPr>
+                <w:rFonts w:ascii="맑은 고딕" w:eastAsia="맑은 고딕" w:hAnsi="맑은 고딕" w:cs="맑은 고딕" w:hint="eastAsia"/>
+                <w:sz w:val="20"/>
+                <w:szCs w:val="20"/>
+              </w:rPr>
+              <w:t>-4</w:t>
+            </w:r>
+          </w:p>
+        </w:tc>
+        <w:tc>
+          <w:tcPr>
+            <w:tcW w:w="1558" w:type="dxa"/>
+            <w:vMerge/>
+            <w:vAlign w:val="center"/>
+          </w:tcPr>
+          <w:p>
+            <w:pPr>
+              <w:spacing w:line="240" w:lineRule="auto"/>
+              <w:jc w:val="center"/>
+              <w:rPr>
+                <w:rFonts w:ascii="맑은 고딕" w:eastAsia="맑은 고딕" w:hAnsi="맑은 고딕" w:cs="맑은 고딕"/>
+                <w:sz w:val="20"/>
+                <w:szCs w:val="20"/>
+              </w:rPr>
+            </w:pPr>
+          </w:p>
+        </w:tc>
+        <w:tc>
+          <w:tcPr>
+            <w:tcW w:w="1558" w:type="dxa"/>
+            <w:vAlign w:val="center"/>
+          </w:tcPr>
+          <w:p>
+            <w:pPr>
+              <w:spacing w:line="240" w:lineRule="auto"/>
+              <w:jc w:val="center"/>
+              <w:rPr>
+                <w:rFonts w:ascii="맑은 고딕" w:eastAsia="맑은 고딕" w:hAnsi="맑은 고딕" w:cs="맑은 고딕"/>
+                <w:sz w:val="20"/>
+                <w:szCs w:val="20"/>
+              </w:rPr>
+            </w:pPr>
+            <w:r>
+              <w:rPr>
+                <w:rFonts w:ascii="맑은 고딕" w:eastAsia="맑은 고딕" w:hAnsi="맑은 고딕" w:cs="맑은 고딕" w:hint="eastAsia"/>
+                <w:sz w:val="20"/>
+                <w:szCs w:val="20"/>
+              </w:rPr>
+              <w:t>생성된 프롬프트 수신</w:t>
+            </w:r>
+          </w:p>
+        </w:tc>
+        <w:tc>
+          <w:tcPr>
+            <w:tcW w:w="1558" w:type="dxa"/>
+            <w:vAlign w:val="center"/>
+          </w:tcPr>
+          <w:p>
+            <w:pPr>
+              <w:spacing w:line="240" w:lineRule="auto"/>
+              <w:jc w:val="center"/>
+              <w:rPr>
+                <w:rFonts w:ascii="맑은 고딕" w:eastAsia="맑은 고딕" w:hAnsi="맑은 고딕" w:cs="맑은 고딕"/>
+                <w:sz w:val="20"/>
+                <w:szCs w:val="20"/>
+              </w:rPr>
+            </w:pPr>
+            <w:r>
+              <w:rPr>
+                <w:rFonts w:ascii="맑은 고딕" w:eastAsia="맑은 고딕" w:hAnsi="맑은 고딕" w:cs="맑은 고딕" w:hint="eastAsia"/>
+                <w:sz w:val="20"/>
+                <w:szCs w:val="20"/>
+              </w:rPr>
+              <w:t xml:space="preserve">프롬프트: </w:t>
+            </w:r>
+            <w:r>
+              <w:rPr>
+                <w:rFonts w:ascii="맑은 고딕" w:eastAsia="맑은 고딕" w:hAnsi="맑은 고딕" w:cs="맑은 고딕"/>
+                <w:sz w:val="20"/>
+                <w:szCs w:val="20"/>
+              </w:rPr>
+              <w:t>‘</w:t>
+            </w:r>
+            <w:r>
+              <w:rPr>
+                <w:rFonts w:ascii="맑은 고딕" w:eastAsia="맑은 고딕" w:hAnsi="맑은 고딕" w:cs="맑은 고딕" w:hint="eastAsia"/>
+                <w:sz w:val="20"/>
+                <w:szCs w:val="20"/>
+              </w:rPr>
+              <w:t xml:space="preserve">사용자가 입력한 </w:t>
+            </w:r>
+            <w:r>
+              <w:rPr>
+                <w:rFonts w:ascii="맑은 고딕" w:eastAsia="맑은 고딕" w:hAnsi="맑은 고딕" w:cs="맑은 고딕" w:hint="eastAsia"/>
+                <w:sz w:val="20"/>
+                <w:szCs w:val="20"/>
+              </w:rPr>
               <w:lastRenderedPageBreak/>
-              <w:t>TC09</w:t>
-            </w:r>
-            <w:r>
-              <w:rPr>
-                <w:rFonts w:ascii="맑은 고딕" w:eastAsia="맑은 고딕" w:hAnsi="맑은 고딕" w:cs="맑은 고딕" w:hint="eastAsia"/>
-                <w:sz w:val="20"/>
-                <w:szCs w:val="20"/>
-              </w:rPr>
-              <w:t>-4</w:t>
-            </w:r>
-          </w:p>
-        </w:tc>
-        <w:tc>
-          <w:tcPr>
-            <w:tcW w:w="1558" w:type="dxa"/>
-            <w:vMerge/>
-            <w:vAlign w:val="center"/>
-          </w:tcPr>
-          <w:p>
-            <w:pPr>
-              <w:spacing w:line="240" w:lineRule="auto"/>
-              <w:jc w:val="center"/>
-              <w:rPr>
-                <w:rFonts w:ascii="맑은 고딕" w:eastAsia="맑은 고딕" w:hAnsi="맑은 고딕" w:cs="맑은 고딕"/>
-                <w:sz w:val="20"/>
-                <w:szCs w:val="20"/>
-              </w:rPr>
-            </w:pPr>
-          </w:p>
-        </w:tc>
-        <w:tc>
-          <w:tcPr>
-            <w:tcW w:w="1558" w:type="dxa"/>
-            <w:vAlign w:val="center"/>
-          </w:tcPr>
-          <w:p>
-            <w:pPr>
-              <w:spacing w:line="240" w:lineRule="auto"/>
-              <w:jc w:val="center"/>
-              <w:rPr>
-                <w:rFonts w:ascii="맑은 고딕" w:eastAsia="맑은 고딕" w:hAnsi="맑은 고딕" w:cs="맑은 고딕"/>
-                <w:sz w:val="20"/>
-                <w:szCs w:val="20"/>
-              </w:rPr>
-            </w:pPr>
-            <w:r>
-              <w:rPr>
-                <w:rFonts w:ascii="맑은 고딕" w:eastAsia="맑은 고딕" w:hAnsi="맑은 고딕" w:cs="맑은 고딕" w:hint="eastAsia"/>
-                <w:sz w:val="20"/>
-                <w:szCs w:val="20"/>
-              </w:rPr>
-              <w:t>생성된 프롬프트 수신</w:t>
-            </w:r>
-          </w:p>
-        </w:tc>
-        <w:tc>
-          <w:tcPr>
-            <w:tcW w:w="1558" w:type="dxa"/>
-            <w:vAlign w:val="center"/>
-          </w:tcPr>
-          <w:p>
-            <w:pPr>
-              <w:spacing w:line="240" w:lineRule="auto"/>
-              <w:jc w:val="center"/>
-              <w:rPr>
-                <w:rFonts w:ascii="맑은 고딕" w:eastAsia="맑은 고딕" w:hAnsi="맑은 고딕" w:cs="맑은 고딕"/>
-                <w:sz w:val="20"/>
-                <w:szCs w:val="20"/>
-              </w:rPr>
-            </w:pPr>
-            <w:r>
-              <w:rPr>
-                <w:rFonts w:ascii="맑은 고딕" w:eastAsia="맑은 고딕" w:hAnsi="맑은 고딕" w:cs="맑은 고딕" w:hint="eastAsia"/>
-                <w:sz w:val="20"/>
-                <w:szCs w:val="20"/>
-              </w:rPr>
-              <w:t xml:space="preserve">프롬프트: </w:t>
-            </w:r>
-            <w:r>
-              <w:rPr>
-                <w:rFonts w:ascii="맑은 고딕" w:eastAsia="맑은 고딕" w:hAnsi="맑은 고딕" w:cs="맑은 고딕"/>
-                <w:sz w:val="20"/>
-                <w:szCs w:val="20"/>
-              </w:rPr>
-              <w:t>‘</w:t>
-            </w:r>
-            <w:r>
-              <w:rPr>
-                <w:rFonts w:ascii="맑은 고딕" w:eastAsia="맑은 고딕" w:hAnsi="맑은 고딕" w:cs="맑은 고딕" w:hint="eastAsia"/>
-                <w:sz w:val="20"/>
-                <w:szCs w:val="20"/>
-              </w:rPr>
-              <w:t>사용자가 입력한 프롬프트'</w:t>
-            </w:r>
-          </w:p>
-        </w:tc>
-        <w:tc>
-          <w:tcPr>
-            <w:tcW w:w="1558" w:type="dxa"/>
-            <w:vAlign w:val="center"/>
-          </w:tcPr>
-          <w:p>
-            <w:pPr>
-              <w:spacing w:line="240" w:lineRule="auto"/>
-              <w:jc w:val="center"/>
-              <w:rPr>
-                <w:rFonts w:ascii="맑은 고딕" w:eastAsia="맑은 고딕" w:hAnsi="맑은 고딕" w:cs="맑은 고딕"/>
-                <w:sz w:val="20"/>
-                <w:szCs w:val="20"/>
-              </w:rPr>
-            </w:pPr>
-            <w:r>
-              <w:rPr>
-                <w:rFonts w:ascii="맑은 고딕" w:eastAsia="맑은 고딕" w:hAnsi="맑은 고딕" w:cs="맑은 고딕" w:hint="eastAsia"/>
-                <w:sz w:val="20"/>
-                <w:szCs w:val="20"/>
-              </w:rPr>
-              <w:t>입력한 프롬프트 텍스트 초기화 및 생성된 프롬프트에 대화방 공유 버튼 표시</w:t>
+              <w:t>프롬프트'</w:t>
+            </w:r>
+          </w:p>
+        </w:tc>
+        <w:tc>
+          <w:tcPr>
+            <w:tcW w:w="1558" w:type="dxa"/>
+            <w:vAlign w:val="center"/>
+          </w:tcPr>
+          <w:p>
+            <w:pPr>
+              <w:spacing w:line="240" w:lineRule="auto"/>
+              <w:jc w:val="center"/>
+              <w:rPr>
+                <w:rFonts w:ascii="맑은 고딕" w:eastAsia="맑은 고딕" w:hAnsi="맑은 고딕" w:cs="맑은 고딕"/>
+                <w:sz w:val="20"/>
+                <w:szCs w:val="20"/>
+              </w:rPr>
+            </w:pPr>
+            <w:r>
+              <w:rPr>
+                <w:rFonts w:ascii="맑은 고딕" w:eastAsia="맑은 고딕" w:hAnsi="맑은 고딕" w:cs="맑은 고딕" w:hint="eastAsia"/>
+                <w:sz w:val="20"/>
+                <w:szCs w:val="20"/>
+              </w:rPr>
+              <w:lastRenderedPageBreak/>
+              <w:t xml:space="preserve">입력한 프롬프트 텍스트 초기화 및 </w:t>
+            </w:r>
+            <w:r>
+              <w:rPr>
+                <w:rFonts w:ascii="맑은 고딕" w:eastAsia="맑은 고딕" w:hAnsi="맑은 고딕" w:cs="맑은 고딕" w:hint="eastAsia"/>
+                <w:sz w:val="20"/>
+                <w:szCs w:val="20"/>
+              </w:rPr>
+              <w:lastRenderedPageBreak/>
+              <w:t>생성된 프롬프트에 대화방 공유 버튼 표시</w:t>
             </w:r>
           </w:p>
         </w:tc>

</xml_diff>